<commit_message>
Update DATABASE.md and PLANNING.md: Add Events table and integration details; enhance SPEC.md with lunar event listings; document SCSS usage in Report.docx
</commit_message>
<xml_diff>
--- a/Report/Report.docx
+++ b/Report/Report.docx
@@ -461,10 +461,9 @@
         <w:pStyle w:val="Heading1"/>
         <w:jc w:val="center"/>
         <w:rPr>
-          <w:b/>
+          <w:b w:val="0"/>
           <w:bCs/>
           <w:color w:val="auto"/>
-          <w:sz w:val="32"/>
           <w:szCs w:val="32"/>
           <w:lang w:val="en-US"/>
         </w:rPr>
@@ -472,10 +471,8 @@
       <w:bookmarkStart w:id="0" w:name="_Toc219129402"/>
       <w:r>
         <w:rPr>
-          <w:b/>
           <w:bCs/>
           <w:color w:val="auto"/>
-          <w:sz w:val="32"/>
           <w:szCs w:val="32"/>
           <w:lang w:val="en-US"/>
         </w:rPr>
@@ -483,10 +480,8 @@
       </w:r>
       <w:r>
         <w:rPr>
-          <w:b/>
           <w:bCs/>
           <w:color w:val="auto"/>
-          <w:sz w:val="32"/>
           <w:szCs w:val="32"/>
           <w:lang w:val="en-US"/>
         </w:rPr>
@@ -742,10 +737,9 @@
         <w:pStyle w:val="Heading1"/>
         <w:jc w:val="center"/>
         <w:rPr>
-          <w:b/>
+          <w:b w:val="0"/>
           <w:bCs/>
           <w:color w:val="auto"/>
-          <w:sz w:val="32"/>
           <w:szCs w:val="32"/>
           <w:lang w:val="en-US"/>
         </w:rPr>
@@ -753,10 +747,8 @@
       <w:bookmarkStart w:id="1" w:name="_Toc219129403"/>
       <w:r>
         <w:rPr>
-          <w:b/>
           <w:bCs/>
           <w:color w:val="auto"/>
-          <w:sz w:val="32"/>
           <w:szCs w:val="32"/>
           <w:lang w:val="en-US"/>
         </w:rPr>
@@ -784,7 +776,6 @@
       </w:sdtPr>
       <w:sdtEndPr>
         <w:rPr>
-          <w:b/>
           <w:bCs/>
           <w:noProof/>
         </w:rPr>
@@ -1712,10 +1703,9 @@
         <w:pStyle w:val="Heading1"/>
         <w:jc w:val="center"/>
         <w:rPr>
-          <w:b/>
+          <w:b w:val="0"/>
           <w:bCs/>
           <w:color w:val="auto"/>
-          <w:sz w:val="32"/>
           <w:szCs w:val="32"/>
           <w:lang w:val="en-US"/>
         </w:rPr>
@@ -1723,10 +1713,8 @@
       <w:bookmarkStart w:id="2" w:name="_Toc219129404"/>
       <w:r>
         <w:rPr>
-          <w:b/>
           <w:bCs/>
           <w:color w:val="auto"/>
-          <w:sz w:val="32"/>
           <w:szCs w:val="32"/>
           <w:lang w:val="en-US"/>
         </w:rPr>
@@ -1908,10 +1896,9 @@
         </w:numPr>
         <w:jc w:val="left"/>
         <w:rPr>
-          <w:b/>
+          <w:b w:val="0"/>
           <w:bCs/>
           <w:color w:val="auto"/>
-          <w:sz w:val="32"/>
           <w:szCs w:val="32"/>
           <w:lang w:val="en-US"/>
         </w:rPr>
@@ -1919,10 +1906,8 @@
       <w:bookmarkStart w:id="3" w:name="_Toc219129405"/>
       <w:r>
         <w:rPr>
-          <w:b/>
           <w:bCs/>
           <w:color w:val="auto"/>
-          <w:sz w:val="32"/>
           <w:szCs w:val="32"/>
           <w:lang w:val="en-US"/>
         </w:rPr>
@@ -2573,10 +2558,186 @@
     </w:p>
     <w:p>
       <w:pPr>
-        <w:rPr>
-          <w:lang w:val="en-US"/>
-        </w:rPr>
-      </w:pPr>
+        <w:pStyle w:val="Heading1"/>
+        <w:numPr>
+          <w:ilvl w:val="0"/>
+          <w:numId w:val="1"/>
+        </w:numPr>
+        <w:rPr>
+          <w:lang w:val="en-US"/>
+        </w:rPr>
+      </w:pPr>
+      <w:r>
+        <w:rPr>
+          <w:lang w:val="en-US"/>
+        </w:rPr>
+        <w:lastRenderedPageBreak/>
+        <w:t>Giao diện</w:t>
+      </w:r>
+    </w:p>
+    <w:p>
+      <w:pPr>
+        <w:pStyle w:val="Heading2"/>
+        <w:numPr>
+          <w:ilvl w:val="0"/>
+          <w:numId w:val="7"/>
+        </w:numPr>
+        <w:rPr>
+          <w:lang w:val="en-US"/>
+        </w:rPr>
+      </w:pPr>
+      <w:r>
+        <w:rPr>
+          <w:lang w:val="en-US"/>
+        </w:rPr>
+        <w:t>SCSS</w:t>
+      </w:r>
+    </w:p>
+    <w:p>
+      <w:pPr>
+        <w:rPr>
+          <w:lang w:val="en-US"/>
+        </w:rPr>
+      </w:pPr>
+      <w:r>
+        <w:rPr>
+          <w:lang w:val="en-US"/>
+        </w:rPr>
+        <w:t>Thay vì sử dụng CSS thông thường, dự án đã quyết định sử dụng SCSS vì hai lý do sau:</w:t>
+      </w:r>
+    </w:p>
+    <w:p>
+      <w:pPr>
+        <w:pStyle w:val="ListParagraph"/>
+        <w:numPr>
+          <w:ilvl w:val="0"/>
+          <w:numId w:val="8"/>
+        </w:numPr>
+        <w:rPr>
+          <w:lang w:val="en-US"/>
+        </w:rPr>
+      </w:pPr>
+      <w:r>
+        <w:rPr>
+          <w:lang w:val="en-US"/>
+        </w:rPr>
+        <w:t>SCSS cho phép viết các lớp con lồng bên trong lớp cha, giúp cho việc sửa giao diện đỡ mất thời gian hơn</w:t>
+      </w:r>
+      <w:r>
+        <w:rPr>
+          <w:lang w:val="en-US"/>
+        </w:rPr>
+        <w:t>.</w:t>
+      </w:r>
+    </w:p>
+    <w:p>
+      <w:pPr>
+        <w:pStyle w:val="ListParagraph"/>
+        <w:numPr>
+          <w:ilvl w:val="0"/>
+          <w:numId w:val="8"/>
+        </w:numPr>
+        <w:rPr>
+          <w:lang w:val="en-US"/>
+        </w:rPr>
+      </w:pPr>
+      <w:r>
+        <w:rPr>
+          <w:lang w:val="en-US"/>
+        </w:rPr>
+        <w:t>SCSS cho phép thiết lập các biến chứa các đặc tính CSS, giúp tái sử dụng các biến đó cho nhiều nơi</w:t>
+      </w:r>
+      <w:r>
+        <w:rPr>
+          <w:lang w:val="en-US"/>
+        </w:rPr>
+        <w:t xml:space="preserve"> trong dự án và có thể thay đổi giao diện nhanh chóng khi cần</w:t>
+      </w:r>
+      <w:r>
+        <w:rPr>
+          <w:lang w:val="en-US"/>
+        </w:rPr>
+        <w:t>.</w:t>
+      </w:r>
+    </w:p>
+    <w:p>
+      <w:pPr>
+        <w:keepNext/>
+        <w:ind w:left="360"/>
+      </w:pPr>
+      <w:r>
+        <w:rPr>
+          <w:noProof/>
+          <w:lang w:val="en-US"/>
+        </w:rPr>
+        <w:drawing>
+          <wp:inline distT="0" distB="0" distL="0" distR="0" wp14:anchorId="0AFC3D97" wp14:editId="00ACE285">
+            <wp:extent cx="5731510" cy="1964055"/>
+            <wp:effectExtent l="0" t="0" r="2540" b="0"/>
+            <wp:docPr id="1467350520" name="Picture 1"/>
+            <wp:cNvGraphicFramePr>
+              <a:graphicFrameLocks xmlns:a="http://schemas.openxmlformats.org/drawingml/2006/main" noChangeAspect="1"/>
+            </wp:cNvGraphicFramePr>
+            <a:graphic xmlns:a="http://schemas.openxmlformats.org/drawingml/2006/main">
+              <a:graphicData uri="http://schemas.openxmlformats.org/drawingml/2006/picture">
+                <pic:pic xmlns:pic="http://schemas.openxmlformats.org/drawingml/2006/picture">
+                  <pic:nvPicPr>
+                    <pic:cNvPr id="1467350520" name="Picture 1467350520"/>
+                    <pic:cNvPicPr/>
+                  </pic:nvPicPr>
+                  <pic:blipFill>
+                    <a:blip r:embed="rId12" cstate="print">
+                      <a:extLst>
+                        <a:ext uri="{28A0092B-C50C-407E-A947-70E740481C1C}">
+                          <a14:useLocalDpi xmlns:a14="http://schemas.microsoft.com/office/drawing/2010/main" val="0"/>
+                        </a:ext>
+                      </a:extLst>
+                    </a:blip>
+                    <a:stretch>
+                      <a:fillRect/>
+                    </a:stretch>
+                  </pic:blipFill>
+                  <pic:spPr>
+                    <a:xfrm>
+                      <a:off x="0" y="0"/>
+                      <a:ext cx="5731510" cy="1964055"/>
+                    </a:xfrm>
+                    <a:prstGeom prst="rect">
+                      <a:avLst/>
+                    </a:prstGeom>
+                  </pic:spPr>
+                </pic:pic>
+              </a:graphicData>
+            </a:graphic>
+          </wp:inline>
+        </w:drawing>
+      </w:r>
+    </w:p>
+    <w:p>
+      <w:pPr>
+        <w:pStyle w:val="Caption"/>
+        <w:jc w:val="center"/>
+        <w:rPr>
+          <w:lang w:val="en-US"/>
+        </w:rPr>
+      </w:pPr>
+      <w:r>
+        <w:t xml:space="preserve">Hình </w:t>
+      </w:r>
+      <w:fldSimple w:instr=" SEQ Hình \* ARABIC ">
+        <w:r>
+          <w:rPr>
+            <w:noProof/>
+          </w:rPr>
+          <w:t>3</w:t>
+        </w:r>
+      </w:fldSimple>
+      <w:r>
+        <w:rPr>
+          <w:lang w:val="en-US"/>
+        </w:rPr>
+        <w:t>: Các biến SCSS trong dự án</w:t>
+      </w:r>
     </w:p>
     <w:p>
       <w:pPr>
@@ -2842,6 +3003,119 @@
 <file path=word/numbering.xml><?xml version="1.0" encoding="utf-8"?>
 <w:numbering xmlns:wpc="http://schemas.microsoft.com/office/word/2010/wordprocessingCanvas" xmlns:cx="http://schemas.microsoft.com/office/drawing/2014/chartex" xmlns:cx1="http://schemas.microsoft.com/office/drawing/2015/9/8/chartex" xmlns:cx2="http://schemas.microsoft.com/office/drawing/2015/10/21/chartex" xmlns:cx3="http://schemas.microsoft.com/office/drawing/2016/5/9/chartex" xmlns:cx4="http://schemas.microsoft.com/office/drawing/2016/5/10/chartex" xmlns:cx5="http://schemas.microsoft.com/office/drawing/2016/5/11/chartex" xmlns:cx6="http://schemas.microsoft.com/office/drawing/2016/5/12/chartex" xmlns:cx7="http://schemas.microsoft.com/office/drawing/2016/5/13/chartex" xmlns:cx8="http://schemas.microsoft.com/office/drawing/2016/5/14/chartex" xmlns:mc="http://schemas.openxmlformats.org/markup-compatibility/2006" xmlns:aink="http://schemas.microsoft.com/office/drawing/2016/ink" xmlns:am3d="http://schemas.microsoft.com/office/drawing/2017/model3d" xmlns:o="urn:schemas-microsoft-com:office:office" xmlns:oel="http://schemas.microsoft.com/office/2019/extlst" xmlns:r="http://schemas.openxmlformats.org/officeDocument/2006/relationships" xmlns:m="http://schemas.openxmlformats.org/officeDocument/2006/math" xmlns:v="urn:schemas-microsoft-com:vml" xmlns:wp14="http://schemas.microsoft.com/office/word/2010/wordprocessingDrawing" xmlns:wp="http://schemas.openxmlformats.org/drawingml/2006/wordprocessingDrawing" xmlns:w10="urn:schemas-microsoft-com:office:word" xmlns:w="http://schemas.openxmlformats.org/wordprocessingml/2006/main" xmlns:w14="http://schemas.microsoft.com/office/word/2010/wordml" xmlns:w15="http://schemas.microsoft.com/office/word/2012/wordml" xmlns:w16cex="http://schemas.microsoft.com/office/word/2018/wordml/cex" xmlns:w16cid="http://schemas.microsoft.com/office/word/2016/wordml/cid" xmlns:w16="http://schemas.microsoft.com/office/word/2018/wordml" xmlns:w16du="http://schemas.microsoft.com/office/word/2023/wordml/word16du" xmlns:w16sdtdh="http://schemas.microsoft.com/office/word/2020/wordml/sdtdatahash" xmlns:w16sdtfl="http://schemas.microsoft.com/office/word/2024/wordml/sdtformatlock" xmlns:w16se="http://schemas.microsoft.com/office/word/2015/wordml/symex" xmlns:wpg="http://schemas.microsoft.com/office/word/2010/wordprocessingGroup" xmlns:wpi="http://schemas.microsoft.com/office/word/2010/wordprocessingInk" xmlns:wne="http://schemas.microsoft.com/office/word/2006/wordml" xmlns:wps="http://schemas.microsoft.com/office/word/2010/wordprocessingShape" mc:Ignorable="w14 w15 w16se w16cid w16 w16cex w16sdtdh w16sdtfl w16du wp14">
   <w:abstractNum w:abstractNumId="0" w15:restartNumberingAfterBreak="0">
+    <w:nsid w:val="01C46E51"/>
+    <w:multiLevelType w:val="hybridMultilevel"/>
+    <w:tmpl w:val="C3287982"/>
+    <w:lvl w:ilvl="0" w:tplc="042A0001">
+      <w:start w:val="1"/>
+      <w:numFmt w:val="bullet"/>
+      <w:lvlText w:val=""/>
+      <w:lvlJc w:val="left"/>
+      <w:pPr>
+        <w:ind w:left="720" w:hanging="360"/>
+      </w:pPr>
+      <w:rPr>
+        <w:rFonts w:ascii="Symbol" w:hAnsi="Symbol" w:hint="default"/>
+      </w:rPr>
+    </w:lvl>
+    <w:lvl w:ilvl="1" w:tplc="042A0003" w:tentative="1">
+      <w:start w:val="1"/>
+      <w:numFmt w:val="bullet"/>
+      <w:lvlText w:val="o"/>
+      <w:lvlJc w:val="left"/>
+      <w:pPr>
+        <w:ind w:left="1440" w:hanging="360"/>
+      </w:pPr>
+      <w:rPr>
+        <w:rFonts w:ascii="Courier New" w:hAnsi="Courier New" w:cs="Courier New" w:hint="default"/>
+      </w:rPr>
+    </w:lvl>
+    <w:lvl w:ilvl="2" w:tplc="042A0005" w:tentative="1">
+      <w:start w:val="1"/>
+      <w:numFmt w:val="bullet"/>
+      <w:lvlText w:val=""/>
+      <w:lvlJc w:val="left"/>
+      <w:pPr>
+        <w:ind w:left="2160" w:hanging="360"/>
+      </w:pPr>
+      <w:rPr>
+        <w:rFonts w:ascii="Wingdings" w:hAnsi="Wingdings" w:hint="default"/>
+      </w:rPr>
+    </w:lvl>
+    <w:lvl w:ilvl="3" w:tplc="042A0001" w:tentative="1">
+      <w:start w:val="1"/>
+      <w:numFmt w:val="bullet"/>
+      <w:lvlText w:val=""/>
+      <w:lvlJc w:val="left"/>
+      <w:pPr>
+        <w:ind w:left="2880" w:hanging="360"/>
+      </w:pPr>
+      <w:rPr>
+        <w:rFonts w:ascii="Symbol" w:hAnsi="Symbol" w:hint="default"/>
+      </w:rPr>
+    </w:lvl>
+    <w:lvl w:ilvl="4" w:tplc="042A0003" w:tentative="1">
+      <w:start w:val="1"/>
+      <w:numFmt w:val="bullet"/>
+      <w:lvlText w:val="o"/>
+      <w:lvlJc w:val="left"/>
+      <w:pPr>
+        <w:ind w:left="3600" w:hanging="360"/>
+      </w:pPr>
+      <w:rPr>
+        <w:rFonts w:ascii="Courier New" w:hAnsi="Courier New" w:cs="Courier New" w:hint="default"/>
+      </w:rPr>
+    </w:lvl>
+    <w:lvl w:ilvl="5" w:tplc="042A0005" w:tentative="1">
+      <w:start w:val="1"/>
+      <w:numFmt w:val="bullet"/>
+      <w:lvlText w:val=""/>
+      <w:lvlJc w:val="left"/>
+      <w:pPr>
+        <w:ind w:left="4320" w:hanging="360"/>
+      </w:pPr>
+      <w:rPr>
+        <w:rFonts w:ascii="Wingdings" w:hAnsi="Wingdings" w:hint="default"/>
+      </w:rPr>
+    </w:lvl>
+    <w:lvl w:ilvl="6" w:tplc="042A0001" w:tentative="1">
+      <w:start w:val="1"/>
+      <w:numFmt w:val="bullet"/>
+      <w:lvlText w:val=""/>
+      <w:lvlJc w:val="left"/>
+      <w:pPr>
+        <w:ind w:left="5040" w:hanging="360"/>
+      </w:pPr>
+      <w:rPr>
+        <w:rFonts w:ascii="Symbol" w:hAnsi="Symbol" w:hint="default"/>
+      </w:rPr>
+    </w:lvl>
+    <w:lvl w:ilvl="7" w:tplc="042A0003" w:tentative="1">
+      <w:start w:val="1"/>
+      <w:numFmt w:val="bullet"/>
+      <w:lvlText w:val="o"/>
+      <w:lvlJc w:val="left"/>
+      <w:pPr>
+        <w:ind w:left="5760" w:hanging="360"/>
+      </w:pPr>
+      <w:rPr>
+        <w:rFonts w:ascii="Courier New" w:hAnsi="Courier New" w:cs="Courier New" w:hint="default"/>
+      </w:rPr>
+    </w:lvl>
+    <w:lvl w:ilvl="8" w:tplc="042A0005" w:tentative="1">
+      <w:start w:val="1"/>
+      <w:numFmt w:val="bullet"/>
+      <w:lvlText w:val=""/>
+      <w:lvlJc w:val="left"/>
+      <w:pPr>
+        <w:ind w:left="6480" w:hanging="360"/>
+      </w:pPr>
+      <w:rPr>
+        <w:rFonts w:ascii="Wingdings" w:hAnsi="Wingdings" w:hint="default"/>
+      </w:rPr>
+    </w:lvl>
+  </w:abstractNum>
+  <w:abstractNum w:abstractNumId="1" w15:restartNumberingAfterBreak="0">
     <w:nsid w:val="0F224058"/>
     <w:multiLevelType w:val="hybridMultilevel"/>
     <w:tmpl w:val="5C2EE2DE"/>
@@ -2954,7 +3228,7 @@
       </w:rPr>
     </w:lvl>
   </w:abstractNum>
-  <w:abstractNum w:abstractNumId="1" w15:restartNumberingAfterBreak="0">
+  <w:abstractNum w:abstractNumId="2" w15:restartNumberingAfterBreak="0">
     <w:nsid w:val="268B6E00"/>
     <w:multiLevelType w:val="hybridMultilevel"/>
     <w:tmpl w:val="9E7C7840"/>
@@ -3043,7 +3317,7 @@
       </w:pPr>
     </w:lvl>
   </w:abstractNum>
-  <w:abstractNum w:abstractNumId="2" w15:restartNumberingAfterBreak="0">
+  <w:abstractNum w:abstractNumId="3" w15:restartNumberingAfterBreak="0">
     <w:nsid w:val="3988675E"/>
     <w:multiLevelType w:val="hybridMultilevel"/>
     <w:tmpl w:val="BE54338E"/>
@@ -3156,7 +3430,7 @@
       </w:rPr>
     </w:lvl>
   </w:abstractNum>
-  <w:abstractNum w:abstractNumId="3" w15:restartNumberingAfterBreak="0">
+  <w:abstractNum w:abstractNumId="4" w15:restartNumberingAfterBreak="0">
     <w:nsid w:val="53FA6AEC"/>
     <w:multiLevelType w:val="hybridMultilevel"/>
     <w:tmpl w:val="39281530"/>
@@ -3246,7 +3520,7 @@
       </w:pPr>
     </w:lvl>
   </w:abstractNum>
-  <w:abstractNum w:abstractNumId="4" w15:restartNumberingAfterBreak="0">
+  <w:abstractNum w:abstractNumId="5" w15:restartNumberingAfterBreak="0">
     <w:nsid w:val="6ABE5484"/>
     <w:multiLevelType w:val="hybridMultilevel"/>
     <w:tmpl w:val="36968FD0"/>
@@ -3359,7 +3633,96 @@
       </w:rPr>
     </w:lvl>
   </w:abstractNum>
-  <w:abstractNum w:abstractNumId="5" w15:restartNumberingAfterBreak="0">
+  <w:abstractNum w:abstractNumId="6" w15:restartNumberingAfterBreak="0">
+    <w:nsid w:val="7E58414A"/>
+    <w:multiLevelType w:val="hybridMultilevel"/>
+    <w:tmpl w:val="89921B1C"/>
+    <w:lvl w:ilvl="0" w:tplc="042A000F">
+      <w:start w:val="1"/>
+      <w:numFmt w:val="decimal"/>
+      <w:lvlText w:val="%1."/>
+      <w:lvlJc w:val="left"/>
+      <w:pPr>
+        <w:ind w:left="720" w:hanging="360"/>
+      </w:pPr>
+      <w:rPr>
+        <w:rFonts w:hint="default"/>
+      </w:rPr>
+    </w:lvl>
+    <w:lvl w:ilvl="1" w:tplc="042A0019" w:tentative="1">
+      <w:start w:val="1"/>
+      <w:numFmt w:val="lowerLetter"/>
+      <w:lvlText w:val="%2."/>
+      <w:lvlJc w:val="left"/>
+      <w:pPr>
+        <w:ind w:left="1440" w:hanging="360"/>
+      </w:pPr>
+    </w:lvl>
+    <w:lvl w:ilvl="2" w:tplc="042A001B" w:tentative="1">
+      <w:start w:val="1"/>
+      <w:numFmt w:val="lowerRoman"/>
+      <w:lvlText w:val="%3."/>
+      <w:lvlJc w:val="right"/>
+      <w:pPr>
+        <w:ind w:left="2160" w:hanging="180"/>
+      </w:pPr>
+    </w:lvl>
+    <w:lvl w:ilvl="3" w:tplc="042A000F" w:tentative="1">
+      <w:start w:val="1"/>
+      <w:numFmt w:val="decimal"/>
+      <w:lvlText w:val="%4."/>
+      <w:lvlJc w:val="left"/>
+      <w:pPr>
+        <w:ind w:left="2880" w:hanging="360"/>
+      </w:pPr>
+    </w:lvl>
+    <w:lvl w:ilvl="4" w:tplc="042A0019" w:tentative="1">
+      <w:start w:val="1"/>
+      <w:numFmt w:val="lowerLetter"/>
+      <w:lvlText w:val="%5."/>
+      <w:lvlJc w:val="left"/>
+      <w:pPr>
+        <w:ind w:left="3600" w:hanging="360"/>
+      </w:pPr>
+    </w:lvl>
+    <w:lvl w:ilvl="5" w:tplc="042A001B" w:tentative="1">
+      <w:start w:val="1"/>
+      <w:numFmt w:val="lowerRoman"/>
+      <w:lvlText w:val="%6."/>
+      <w:lvlJc w:val="right"/>
+      <w:pPr>
+        <w:ind w:left="4320" w:hanging="180"/>
+      </w:pPr>
+    </w:lvl>
+    <w:lvl w:ilvl="6" w:tplc="042A000F" w:tentative="1">
+      <w:start w:val="1"/>
+      <w:numFmt w:val="decimal"/>
+      <w:lvlText w:val="%7."/>
+      <w:lvlJc w:val="left"/>
+      <w:pPr>
+        <w:ind w:left="5040" w:hanging="360"/>
+      </w:pPr>
+    </w:lvl>
+    <w:lvl w:ilvl="7" w:tplc="042A0019" w:tentative="1">
+      <w:start w:val="1"/>
+      <w:numFmt w:val="lowerLetter"/>
+      <w:lvlText w:val="%8."/>
+      <w:lvlJc w:val="left"/>
+      <w:pPr>
+        <w:ind w:left="5760" w:hanging="360"/>
+      </w:pPr>
+    </w:lvl>
+    <w:lvl w:ilvl="8" w:tplc="042A001B" w:tentative="1">
+      <w:start w:val="1"/>
+      <w:numFmt w:val="lowerRoman"/>
+      <w:lvlText w:val="%9."/>
+      <w:lvlJc w:val="right"/>
+      <w:pPr>
+        <w:ind w:left="6480" w:hanging="180"/>
+      </w:pPr>
+    </w:lvl>
+  </w:abstractNum>
+  <w:abstractNum w:abstractNumId="7" w15:restartNumberingAfterBreak="0">
     <w:nsid w:val="7FAD66EA"/>
     <w:multiLevelType w:val="hybridMultilevel"/>
     <w:tmpl w:val="39281530"/>
@@ -3450,22 +3813,28 @@
     </w:lvl>
   </w:abstractNum>
   <w:num w:numId="1" w16cid:durableId="408618735">
+    <w:abstractNumId w:val="2"/>
+  </w:num>
+  <w:num w:numId="2" w16cid:durableId="2133667262">
+    <w:abstractNumId w:val="7"/>
+  </w:num>
+  <w:num w:numId="3" w16cid:durableId="572853580">
+    <w:abstractNumId w:val="4"/>
+  </w:num>
+  <w:num w:numId="4" w16cid:durableId="886769297">
     <w:abstractNumId w:val="1"/>
   </w:num>
-  <w:num w:numId="2" w16cid:durableId="2133667262">
+  <w:num w:numId="5" w16cid:durableId="968247385">
+    <w:abstractNumId w:val="3"/>
+  </w:num>
+  <w:num w:numId="6" w16cid:durableId="434525191">
     <w:abstractNumId w:val="5"/>
   </w:num>
-  <w:num w:numId="3" w16cid:durableId="572853580">
-    <w:abstractNumId w:val="3"/>
+  <w:num w:numId="7" w16cid:durableId="1667636056">
+    <w:abstractNumId w:val="6"/>
   </w:num>
-  <w:num w:numId="4" w16cid:durableId="886769297">
+  <w:num w:numId="8" w16cid:durableId="410472663">
     <w:abstractNumId w:val="0"/>
-  </w:num>
-  <w:num w:numId="5" w16cid:durableId="968247385">
-    <w:abstractNumId w:val="2"/>
-  </w:num>
-  <w:num w:numId="6" w16cid:durableId="434525191">
-    <w:abstractNumId w:val="4"/>
   </w:num>
 </w:numbering>
 </file>
@@ -3879,7 +4248,7 @@
     <w:link w:val="Heading1Char"/>
     <w:uiPriority w:val="9"/>
     <w:qFormat/>
-    <w:rsid w:val="00756CF9"/>
+    <w:rsid w:val="00CA6D6B"/>
     <w:pPr>
       <w:keepNext/>
       <w:keepLines/>
@@ -3888,8 +4257,9 @@
     </w:pPr>
     <w:rPr>
       <w:rFonts w:asciiTheme="majorHAnsi" w:eastAsiaTheme="majorEastAsia" w:hAnsiTheme="majorHAnsi" w:cstheme="majorBidi"/>
+      <w:b/>
       <w:color w:val="000000" w:themeColor="text1"/>
-      <w:sz w:val="40"/>
+      <w:sz w:val="32"/>
       <w:szCs w:val="40"/>
     </w:rPr>
   </w:style>
@@ -3901,7 +4271,7 @@
     <w:uiPriority w:val="9"/>
     <w:unhideWhenUsed/>
     <w:qFormat/>
-    <w:rsid w:val="00756CF9"/>
+    <w:rsid w:val="00CA6D6B"/>
     <w:pPr>
       <w:keepNext/>
       <w:keepLines/>
@@ -3911,7 +4281,6 @@
     <w:rPr>
       <w:rFonts w:asciiTheme="majorHAnsi" w:eastAsiaTheme="majorEastAsia" w:hAnsiTheme="majorHAnsi" w:cstheme="majorBidi"/>
       <w:color w:val="000000" w:themeColor="text1"/>
-      <w:sz w:val="32"/>
       <w:szCs w:val="32"/>
     </w:rPr>
   </w:style>
@@ -4101,11 +4470,12 @@
     <w:basedOn w:val="DefaultParagraphFont"/>
     <w:link w:val="Heading1"/>
     <w:uiPriority w:val="9"/>
-    <w:rsid w:val="00756CF9"/>
+    <w:rsid w:val="00CA6D6B"/>
     <w:rPr>
       <w:rFonts w:asciiTheme="majorHAnsi" w:eastAsiaTheme="majorEastAsia" w:hAnsiTheme="majorHAnsi" w:cstheme="majorBidi"/>
+      <w:b/>
       <w:color w:val="000000" w:themeColor="text1"/>
-      <w:sz w:val="40"/>
+      <w:sz w:val="32"/>
       <w:szCs w:val="40"/>
     </w:rPr>
   </w:style>
@@ -4114,11 +4484,10 @@
     <w:basedOn w:val="DefaultParagraphFont"/>
     <w:link w:val="Heading2"/>
     <w:uiPriority w:val="9"/>
-    <w:rsid w:val="00756CF9"/>
+    <w:rsid w:val="00CA6D6B"/>
     <w:rPr>
       <w:rFonts w:asciiTheme="majorHAnsi" w:eastAsiaTheme="majorEastAsia" w:hAnsiTheme="majorHAnsi" w:cstheme="majorBidi"/>
       <w:color w:val="000000" w:themeColor="text1"/>
-      <w:sz w:val="32"/>
       <w:szCs w:val="32"/>
     </w:rPr>
   </w:style>
@@ -4461,7 +4830,6 @@
     <w:rPr>
       <w:color w:val="0F4761" w:themeColor="accent1" w:themeShade="BF"/>
       <w:kern w:val="0"/>
-      <w:sz w:val="32"/>
       <w:szCs w:val="32"/>
       <w:lang w:val="en-US"/>
       <w14:ligatures w14:val="none"/>

</xml_diff>

<commit_message>
feat: enhance Calendar component with dynamic background and improved layout
</commit_message>
<xml_diff>
--- a/Report/Report.docx
+++ b/Report/Report.docx
@@ -468,7 +468,7 @@
           <w:lang w:val="en-US"/>
         </w:rPr>
       </w:pPr>
-      <w:bookmarkStart w:id="0" w:name="_Toc219129402"/>
+      <w:bookmarkStart w:id="0" w:name="_Toc219301869"/>
       <w:r>
         <w:rPr>
           <w:bCs/>
@@ -744,7 +744,7 @@
           <w:lang w:val="en-US"/>
         </w:rPr>
       </w:pPr>
-      <w:bookmarkStart w:id="1" w:name="_Toc219129403"/>
+      <w:bookmarkStart w:id="1" w:name="_Toc219301870"/>
       <w:r>
         <w:rPr>
           <w:bCs/>
@@ -761,6 +761,7 @@
       <w:sdtPr>
         <w:rPr>
           <w:rFonts w:ascii="Times New Roman" w:eastAsiaTheme="minorHAnsi" w:hAnsi="Times New Roman" w:cstheme="minorBidi"/>
+          <w:b w:val="0"/>
           <w:color w:val="auto"/>
           <w:kern w:val="2"/>
           <w:sz w:val="28"/>
@@ -793,7 +794,11 @@
               <w:tab w:val="right" w:leader="dot" w:pos="9016"/>
             </w:tabs>
             <w:rPr>
+              <w:rFonts w:asciiTheme="minorHAnsi" w:eastAsiaTheme="minorEastAsia" w:hAnsiTheme="minorHAnsi"/>
               <w:noProof/>
+              <w:sz w:val="24"/>
+              <w:szCs w:val="24"/>
+              <w:lang w:eastAsia="vi-VN"/>
             </w:rPr>
           </w:pPr>
           <w:r>
@@ -805,11 +810,10 @@
           <w:r>
             <w:fldChar w:fldCharType="separate"/>
           </w:r>
-          <w:hyperlink w:anchor="_Toc219129402" w:history="1">
+          <w:hyperlink w:anchor="_Toc219301869" w:history="1">
             <w:r>
               <w:rPr>
                 <w:rStyle w:val="Hyperlink"/>
-                <w:b/>
                 <w:bCs/>
                 <w:noProof/>
                 <w:lang w:val="en-US"/>
@@ -835,7 +839,7 @@
                 <w:noProof/>
                 <w:webHidden/>
               </w:rPr>
-              <w:instrText xml:space="preserve"> PAGEREF _Toc219129402 \h </w:instrText>
+              <w:instrText xml:space="preserve"> PAGEREF _Toc219301869 \h </w:instrText>
             </w:r>
             <w:r>
               <w:rPr>
@@ -873,14 +877,17 @@
               <w:tab w:val="right" w:leader="dot" w:pos="9016"/>
             </w:tabs>
             <w:rPr>
+              <w:rFonts w:asciiTheme="minorHAnsi" w:eastAsiaTheme="minorEastAsia" w:hAnsiTheme="minorHAnsi"/>
               <w:noProof/>
+              <w:sz w:val="24"/>
+              <w:szCs w:val="24"/>
+              <w:lang w:eastAsia="vi-VN"/>
             </w:rPr>
           </w:pPr>
-          <w:hyperlink w:anchor="_Toc219129403" w:history="1">
+          <w:hyperlink w:anchor="_Toc219301870" w:history="1">
             <w:r>
               <w:rPr>
                 <w:rStyle w:val="Hyperlink"/>
-                <w:b/>
                 <w:bCs/>
                 <w:noProof/>
                 <w:lang w:val="en-US"/>
@@ -906,7 +913,7 @@
                 <w:noProof/>
                 <w:webHidden/>
               </w:rPr>
-              <w:instrText xml:space="preserve"> PAGEREF _Toc219129403 \h </w:instrText>
+              <w:instrText xml:space="preserve"> PAGEREF _Toc219301870 \h </w:instrText>
             </w:r>
             <w:r>
               <w:rPr>
@@ -944,14 +951,17 @@
               <w:tab w:val="right" w:leader="dot" w:pos="9016"/>
             </w:tabs>
             <w:rPr>
+              <w:rFonts w:asciiTheme="minorHAnsi" w:eastAsiaTheme="minorEastAsia" w:hAnsiTheme="minorHAnsi"/>
               <w:noProof/>
+              <w:sz w:val="24"/>
+              <w:szCs w:val="24"/>
+              <w:lang w:eastAsia="vi-VN"/>
             </w:rPr>
           </w:pPr>
-          <w:hyperlink w:anchor="_Toc219129404" w:history="1">
+          <w:hyperlink w:anchor="_Toc219301871" w:history="1">
             <w:r>
               <w:rPr>
                 <w:rStyle w:val="Hyperlink"/>
-                <w:b/>
                 <w:bCs/>
                 <w:noProof/>
                 <w:lang w:val="en-US"/>
@@ -977,7 +987,7 @@
                 <w:noProof/>
                 <w:webHidden/>
               </w:rPr>
-              <w:instrText xml:space="preserve"> PAGEREF _Toc219129404 \h </w:instrText>
+              <w:instrText xml:space="preserve"> PAGEREF _Toc219301871 \h </w:instrText>
             </w:r>
             <w:r>
               <w:rPr>
@@ -1016,14 +1026,17 @@
               <w:tab w:val="right" w:leader="dot" w:pos="9016"/>
             </w:tabs>
             <w:rPr>
+              <w:rFonts w:asciiTheme="minorHAnsi" w:eastAsiaTheme="minorEastAsia" w:hAnsiTheme="minorHAnsi"/>
               <w:noProof/>
+              <w:sz w:val="24"/>
+              <w:szCs w:val="24"/>
+              <w:lang w:eastAsia="vi-VN"/>
             </w:rPr>
           </w:pPr>
-          <w:hyperlink w:anchor="_Toc219129405" w:history="1">
+          <w:hyperlink w:anchor="_Toc219301872" w:history="1">
             <w:r>
               <w:rPr>
                 <w:rStyle w:val="Hyperlink"/>
-                <w:b/>
                 <w:bCs/>
                 <w:noProof/>
                 <w:lang w:val="en-US"/>
@@ -1032,14 +1045,17 @@
             </w:r>
             <w:r>
               <w:rPr>
-                <w:noProof/>
+                <w:rFonts w:asciiTheme="minorHAnsi" w:eastAsiaTheme="minorEastAsia" w:hAnsiTheme="minorHAnsi"/>
+                <w:noProof/>
+                <w:sz w:val="24"/>
+                <w:szCs w:val="24"/>
+                <w:lang w:eastAsia="vi-VN"/>
               </w:rPr>
               <w:tab/>
             </w:r>
             <w:r>
               <w:rPr>
                 <w:rStyle w:val="Hyperlink"/>
-                <w:b/>
                 <w:bCs/>
                 <w:noProof/>
                 <w:lang w:val="en-US"/>
@@ -1065,7 +1081,7 @@
                 <w:noProof/>
                 <w:webHidden/>
               </w:rPr>
-              <w:instrText xml:space="preserve"> PAGEREF _Toc219129405 \h </w:instrText>
+              <w:instrText xml:space="preserve"> PAGEREF _Toc219301872 \h </w:instrText>
             </w:r>
             <w:r>
               <w:rPr>
@@ -1100,14 +1116,18 @@
           <w:pPr>
             <w:pStyle w:val="TOC2"/>
             <w:tabs>
-              <w:tab w:val="left" w:pos="720"/>
+              <w:tab w:val="left" w:pos="960"/>
               <w:tab w:val="right" w:leader="dot" w:pos="9016"/>
             </w:tabs>
             <w:rPr>
+              <w:rFonts w:asciiTheme="minorHAnsi" w:eastAsiaTheme="minorEastAsia" w:hAnsiTheme="minorHAnsi"/>
               <w:noProof/>
+              <w:sz w:val="24"/>
+              <w:szCs w:val="24"/>
+              <w:lang w:eastAsia="vi-VN"/>
             </w:rPr>
           </w:pPr>
-          <w:hyperlink w:anchor="_Toc219129406" w:history="1">
+          <w:hyperlink w:anchor="_Toc219301873" w:history="1">
             <w:r>
               <w:rPr>
                 <w:rStyle w:val="Hyperlink"/>
@@ -1118,7 +1138,11 @@
             </w:r>
             <w:r>
               <w:rPr>
-                <w:noProof/>
+                <w:rFonts w:asciiTheme="minorHAnsi" w:eastAsiaTheme="minorEastAsia" w:hAnsiTheme="minorHAnsi"/>
+                <w:noProof/>
+                <w:sz w:val="24"/>
+                <w:szCs w:val="24"/>
+                <w:lang w:eastAsia="vi-VN"/>
               </w:rPr>
               <w:tab/>
             </w:r>
@@ -1149,7 +1173,7 @@
                 <w:noProof/>
                 <w:webHidden/>
               </w:rPr>
-              <w:instrText xml:space="preserve"> PAGEREF _Toc219129406 \h </w:instrText>
+              <w:instrText xml:space="preserve"> PAGEREF _Toc219301873 \h </w:instrText>
             </w:r>
             <w:r>
               <w:rPr>
@@ -1184,14 +1208,18 @@
           <w:pPr>
             <w:pStyle w:val="TOC2"/>
             <w:tabs>
-              <w:tab w:val="left" w:pos="720"/>
+              <w:tab w:val="left" w:pos="960"/>
               <w:tab w:val="right" w:leader="dot" w:pos="9016"/>
             </w:tabs>
             <w:rPr>
+              <w:rFonts w:asciiTheme="minorHAnsi" w:eastAsiaTheme="minorEastAsia" w:hAnsiTheme="minorHAnsi"/>
               <w:noProof/>
+              <w:sz w:val="24"/>
+              <w:szCs w:val="24"/>
+              <w:lang w:eastAsia="vi-VN"/>
             </w:rPr>
           </w:pPr>
-          <w:hyperlink w:anchor="_Toc219129407" w:history="1">
+          <w:hyperlink w:anchor="_Toc219301874" w:history="1">
             <w:r>
               <w:rPr>
                 <w:rStyle w:val="Hyperlink"/>
@@ -1202,7 +1230,11 @@
             </w:r>
             <w:r>
               <w:rPr>
-                <w:noProof/>
+                <w:rFonts w:asciiTheme="minorHAnsi" w:eastAsiaTheme="minorEastAsia" w:hAnsiTheme="minorHAnsi"/>
+                <w:noProof/>
+                <w:sz w:val="24"/>
+                <w:szCs w:val="24"/>
+                <w:lang w:eastAsia="vi-VN"/>
               </w:rPr>
               <w:tab/>
             </w:r>
@@ -1233,7 +1265,7 @@
                 <w:noProof/>
                 <w:webHidden/>
               </w:rPr>
-              <w:instrText xml:space="preserve"> PAGEREF _Toc219129407 \h </w:instrText>
+              <w:instrText xml:space="preserve"> PAGEREF _Toc219301874 \h </w:instrText>
             </w:r>
             <w:r>
               <w:rPr>
@@ -1268,14 +1300,18 @@
           <w:pPr>
             <w:pStyle w:val="TOC2"/>
             <w:tabs>
-              <w:tab w:val="left" w:pos="720"/>
+              <w:tab w:val="left" w:pos="960"/>
               <w:tab w:val="right" w:leader="dot" w:pos="9016"/>
             </w:tabs>
             <w:rPr>
+              <w:rFonts w:asciiTheme="minorHAnsi" w:eastAsiaTheme="minorEastAsia" w:hAnsiTheme="minorHAnsi"/>
               <w:noProof/>
+              <w:sz w:val="24"/>
+              <w:szCs w:val="24"/>
+              <w:lang w:eastAsia="vi-VN"/>
             </w:rPr>
           </w:pPr>
-          <w:hyperlink w:anchor="_Toc219129408" w:history="1">
+          <w:hyperlink w:anchor="_Toc219301875" w:history="1">
             <w:r>
               <w:rPr>
                 <w:rStyle w:val="Hyperlink"/>
@@ -1286,7 +1322,11 @@
             </w:r>
             <w:r>
               <w:rPr>
-                <w:noProof/>
+                <w:rFonts w:asciiTheme="minorHAnsi" w:eastAsiaTheme="minorEastAsia" w:hAnsiTheme="minorHAnsi"/>
+                <w:noProof/>
+                <w:sz w:val="24"/>
+                <w:szCs w:val="24"/>
+                <w:lang w:eastAsia="vi-VN"/>
               </w:rPr>
               <w:tab/>
             </w:r>
@@ -1317,7 +1357,7 @@
                 <w:noProof/>
                 <w:webHidden/>
               </w:rPr>
-              <w:instrText xml:space="preserve"> PAGEREF _Toc219129408 \h </w:instrText>
+              <w:instrText xml:space="preserve"> PAGEREF _Toc219301875 \h </w:instrText>
             </w:r>
             <w:r>
               <w:rPr>
@@ -1352,14 +1392,18 @@
           <w:pPr>
             <w:pStyle w:val="TOC2"/>
             <w:tabs>
-              <w:tab w:val="left" w:pos="720"/>
+              <w:tab w:val="left" w:pos="960"/>
               <w:tab w:val="right" w:leader="dot" w:pos="9016"/>
             </w:tabs>
             <w:rPr>
+              <w:rFonts w:asciiTheme="minorHAnsi" w:eastAsiaTheme="minorEastAsia" w:hAnsiTheme="minorHAnsi"/>
               <w:noProof/>
+              <w:sz w:val="24"/>
+              <w:szCs w:val="24"/>
+              <w:lang w:eastAsia="vi-VN"/>
             </w:rPr>
           </w:pPr>
-          <w:hyperlink w:anchor="_Toc219129409" w:history="1">
+          <w:hyperlink w:anchor="_Toc219301876" w:history="1">
             <w:r>
               <w:rPr>
                 <w:rStyle w:val="Hyperlink"/>
@@ -1370,7 +1414,11 @@
             </w:r>
             <w:r>
               <w:rPr>
-                <w:noProof/>
+                <w:rFonts w:asciiTheme="minorHAnsi" w:eastAsiaTheme="minorEastAsia" w:hAnsiTheme="minorHAnsi"/>
+                <w:noProof/>
+                <w:sz w:val="24"/>
+                <w:szCs w:val="24"/>
+                <w:lang w:eastAsia="vi-VN"/>
               </w:rPr>
               <w:tab/>
             </w:r>
@@ -1401,7 +1449,7 @@
                 <w:noProof/>
                 <w:webHidden/>
               </w:rPr>
-              <w:instrText xml:space="preserve"> PAGEREF _Toc219129409 \h </w:instrText>
+              <w:instrText xml:space="preserve"> PAGEREF _Toc219301876 \h </w:instrText>
             </w:r>
             <w:r>
               <w:rPr>
@@ -1436,25 +1484,125 @@
           <w:pPr>
             <w:pStyle w:val="TOC2"/>
             <w:tabs>
+              <w:tab w:val="left" w:pos="960"/>
+              <w:tab w:val="right" w:leader="dot" w:pos="9016"/>
+            </w:tabs>
+            <w:rPr>
+              <w:rFonts w:asciiTheme="minorHAnsi" w:eastAsiaTheme="minorEastAsia" w:hAnsiTheme="minorHAnsi"/>
+              <w:noProof/>
+              <w:sz w:val="24"/>
+              <w:szCs w:val="24"/>
+              <w:lang w:eastAsia="vi-VN"/>
+            </w:rPr>
+          </w:pPr>
+          <w:hyperlink w:anchor="_Toc219301877" w:history="1">
+            <w:r>
+              <w:rPr>
+                <w:rStyle w:val="Hyperlink"/>
+                <w:noProof/>
+                <w:lang w:val="en-US"/>
+              </w:rPr>
+              <w:t>5.</w:t>
+            </w:r>
+            <w:r>
+              <w:rPr>
+                <w:rFonts w:asciiTheme="minorHAnsi" w:eastAsiaTheme="minorEastAsia" w:hAnsiTheme="minorHAnsi"/>
+                <w:noProof/>
+                <w:sz w:val="24"/>
+                <w:szCs w:val="24"/>
+                <w:lang w:eastAsia="vi-VN"/>
+              </w:rPr>
+              <w:tab/>
+            </w:r>
+            <w:r>
+              <w:rPr>
+                <w:rStyle w:val="Hyperlink"/>
+                <w:noProof/>
+                <w:lang w:val="en-US"/>
+              </w:rPr>
+              <w:t>Database</w:t>
+            </w:r>
+            <w:r>
+              <w:rPr>
+                <w:noProof/>
+                <w:webHidden/>
+              </w:rPr>
+              <w:tab/>
+            </w:r>
+            <w:r>
+              <w:rPr>
+                <w:noProof/>
+                <w:webHidden/>
+              </w:rPr>
+              <w:fldChar w:fldCharType="begin"/>
+            </w:r>
+            <w:r>
+              <w:rPr>
+                <w:noProof/>
+                <w:webHidden/>
+              </w:rPr>
+              <w:instrText xml:space="preserve"> PAGEREF _Toc219301877 \h </w:instrText>
+            </w:r>
+            <w:r>
+              <w:rPr>
+                <w:noProof/>
+                <w:webHidden/>
+              </w:rPr>
+            </w:r>
+            <w:r>
+              <w:rPr>
+                <w:noProof/>
+                <w:webHidden/>
+              </w:rPr>
+              <w:fldChar w:fldCharType="separate"/>
+            </w:r>
+            <w:r>
+              <w:rPr>
+                <w:noProof/>
+                <w:webHidden/>
+              </w:rPr>
+              <w:t>2</w:t>
+            </w:r>
+            <w:r>
+              <w:rPr>
+                <w:noProof/>
+                <w:webHidden/>
+              </w:rPr>
+              <w:fldChar w:fldCharType="end"/>
+            </w:r>
+          </w:hyperlink>
+        </w:p>
+        <w:p>
+          <w:pPr>
+            <w:pStyle w:val="TOC1"/>
+            <w:tabs>
               <w:tab w:val="left" w:pos="720"/>
               <w:tab w:val="right" w:leader="dot" w:pos="9016"/>
             </w:tabs>
             <w:rPr>
+              <w:rFonts w:asciiTheme="minorHAnsi" w:eastAsiaTheme="minorEastAsia" w:hAnsiTheme="minorHAnsi"/>
               <w:noProof/>
+              <w:sz w:val="24"/>
+              <w:szCs w:val="24"/>
+              <w:lang w:eastAsia="vi-VN"/>
             </w:rPr>
           </w:pPr>
-          <w:hyperlink w:anchor="_Toc219129410" w:history="1">
+          <w:hyperlink w:anchor="_Toc219301878" w:history="1">
             <w:r>
               <w:rPr>
                 <w:rStyle w:val="Hyperlink"/>
                 <w:noProof/>
                 <w:lang w:val="en-US"/>
               </w:rPr>
-              <w:t>5.</w:t>
-            </w:r>
-            <w:r>
-              <w:rPr>
-                <w:noProof/>
+              <w:t>II.</w:t>
+            </w:r>
+            <w:r>
+              <w:rPr>
+                <w:rFonts w:asciiTheme="minorHAnsi" w:eastAsiaTheme="minorEastAsia" w:hAnsiTheme="minorHAnsi"/>
+                <w:noProof/>
+                <w:sz w:val="24"/>
+                <w:szCs w:val="24"/>
+                <w:lang w:eastAsia="vi-VN"/>
               </w:rPr>
               <w:tab/>
             </w:r>
@@ -1464,7 +1612,7 @@
                 <w:noProof/>
                 <w:lang w:val="en-US"/>
               </w:rPr>
-              <w:t>Database</w:t>
+              <w:t>Giao diện</w:t>
             </w:r>
             <w:r>
               <w:rPr>
@@ -1485,7 +1633,7 @@
                 <w:noProof/>
                 <w:webHidden/>
               </w:rPr>
-              <w:instrText xml:space="preserve"> PAGEREF _Toc219129410 \h </w:instrText>
+              <w:instrText xml:space="preserve"> PAGEREF _Toc219301878 \h </w:instrText>
             </w:r>
             <w:r>
               <w:rPr>
@@ -1505,7 +1653,99 @@
                 <w:noProof/>
                 <w:webHidden/>
               </w:rPr>
-              <w:t>2</w:t>
+              <w:t>3</w:t>
+            </w:r>
+            <w:r>
+              <w:rPr>
+                <w:noProof/>
+                <w:webHidden/>
+              </w:rPr>
+              <w:fldChar w:fldCharType="end"/>
+            </w:r>
+          </w:hyperlink>
+        </w:p>
+        <w:p>
+          <w:pPr>
+            <w:pStyle w:val="TOC2"/>
+            <w:tabs>
+              <w:tab w:val="left" w:pos="960"/>
+              <w:tab w:val="right" w:leader="dot" w:pos="9016"/>
+            </w:tabs>
+            <w:rPr>
+              <w:rFonts w:asciiTheme="minorHAnsi" w:eastAsiaTheme="minorEastAsia" w:hAnsiTheme="minorHAnsi"/>
+              <w:noProof/>
+              <w:sz w:val="24"/>
+              <w:szCs w:val="24"/>
+              <w:lang w:eastAsia="vi-VN"/>
+            </w:rPr>
+          </w:pPr>
+          <w:hyperlink w:anchor="_Toc219301879" w:history="1">
+            <w:r>
+              <w:rPr>
+                <w:rStyle w:val="Hyperlink"/>
+                <w:noProof/>
+                <w:lang w:val="en-US"/>
+              </w:rPr>
+              <w:t>1.</w:t>
+            </w:r>
+            <w:r>
+              <w:rPr>
+                <w:rFonts w:asciiTheme="minorHAnsi" w:eastAsiaTheme="minorEastAsia" w:hAnsiTheme="minorHAnsi"/>
+                <w:noProof/>
+                <w:sz w:val="24"/>
+                <w:szCs w:val="24"/>
+                <w:lang w:eastAsia="vi-VN"/>
+              </w:rPr>
+              <w:tab/>
+            </w:r>
+            <w:r>
+              <w:rPr>
+                <w:rStyle w:val="Hyperlink"/>
+                <w:noProof/>
+                <w:lang w:val="en-US"/>
+              </w:rPr>
+              <w:t>SCSS</w:t>
+            </w:r>
+            <w:r>
+              <w:rPr>
+                <w:noProof/>
+                <w:webHidden/>
+              </w:rPr>
+              <w:tab/>
+            </w:r>
+            <w:r>
+              <w:rPr>
+                <w:noProof/>
+                <w:webHidden/>
+              </w:rPr>
+              <w:fldChar w:fldCharType="begin"/>
+            </w:r>
+            <w:r>
+              <w:rPr>
+                <w:noProof/>
+                <w:webHidden/>
+              </w:rPr>
+              <w:instrText xml:space="preserve"> PAGEREF _Toc219301879 \h </w:instrText>
+            </w:r>
+            <w:r>
+              <w:rPr>
+                <w:noProof/>
+                <w:webHidden/>
+              </w:rPr>
+            </w:r>
+            <w:r>
+              <w:rPr>
+                <w:noProof/>
+                <w:webHidden/>
+              </w:rPr>
+              <w:fldChar w:fldCharType="separate"/>
+            </w:r>
+            <w:r>
+              <w:rPr>
+                <w:noProof/>
+                <w:webHidden/>
+              </w:rPr>
+              <w:t>3</w:t>
             </w:r>
             <w:r>
               <w:rPr>
@@ -1710,7 +1950,7 @@
           <w:lang w:val="en-US"/>
         </w:rPr>
       </w:pPr>
-      <w:bookmarkStart w:id="2" w:name="_Toc219129404"/>
+      <w:bookmarkStart w:id="2" w:name="_Toc219301871"/>
       <w:r>
         <w:rPr>
           <w:bCs/>
@@ -1903,7 +2143,7 @@
           <w:lang w:val="en-US"/>
         </w:rPr>
       </w:pPr>
-      <w:bookmarkStart w:id="3" w:name="_Toc219129405"/>
+      <w:bookmarkStart w:id="3" w:name="_Toc219301872"/>
       <w:r>
         <w:rPr>
           <w:bCs/>
@@ -1911,7 +2151,7 @@
           <w:szCs w:val="32"/>
           <w:lang w:val="en-US"/>
         </w:rPr>
-        <w:t>GIỚI THIỆU SCIENCECALENDAR</w:t>
+        <w:t>Giới thiệu ScienceCalendar</w:t>
       </w:r>
       <w:bookmarkEnd w:id="3"/>
     </w:p>
@@ -1926,7 +2166,7 @@
           <w:lang w:val="en-US"/>
         </w:rPr>
       </w:pPr>
-      <w:bookmarkStart w:id="4" w:name="_Toc219129406"/>
+      <w:bookmarkStart w:id="4" w:name="_Toc219301873"/>
       <w:r>
         <w:rPr>
           <w:lang w:val="en-US"/>
@@ -1959,7 +2199,7 @@
           <w:lang w:val="en-US"/>
         </w:rPr>
       </w:pPr>
-      <w:bookmarkStart w:id="5" w:name="_Toc219129407"/>
+      <w:bookmarkStart w:id="5" w:name="_Toc219301874"/>
       <w:r>
         <w:rPr>
           <w:lang w:val="en-US"/>
@@ -2090,7 +2330,7 @@
           <w:lang w:val="en-US"/>
         </w:rPr>
       </w:pPr>
-      <w:bookmarkStart w:id="6" w:name="_Toc219129408"/>
+      <w:bookmarkStart w:id="6" w:name="_Toc219301875"/>
       <w:r>
         <w:rPr>
           <w:lang w:val="en-US"/>
@@ -2162,7 +2402,7 @@
           <w:lang w:val="en-US"/>
         </w:rPr>
       </w:pPr>
-      <w:bookmarkStart w:id="7" w:name="_Toc219129409"/>
+      <w:bookmarkStart w:id="7" w:name="_Toc219301876"/>
       <w:r>
         <w:rPr>
           <w:noProof/>
@@ -2281,7 +2521,7 @@
           <w:lang w:val="en-US"/>
         </w:rPr>
       </w:pPr>
-      <w:bookmarkStart w:id="8" w:name="_Toc219129410"/>
+      <w:bookmarkStart w:id="8" w:name="_Toc219301877"/>
       <w:r>
         <w:rPr>
           <w:lang w:val="en-US"/>
@@ -2567,6 +2807,7 @@
           <w:lang w:val="en-US"/>
         </w:rPr>
       </w:pPr>
+      <w:bookmarkStart w:id="9" w:name="_Toc219301878"/>
       <w:r>
         <w:rPr>
           <w:lang w:val="en-US"/>
@@ -2574,6 +2815,7 @@
         <w:lastRenderedPageBreak/>
         <w:t>Giao diện</w:t>
       </w:r>
+      <w:bookmarkEnd w:id="9"/>
     </w:p>
     <w:p>
       <w:pPr>
@@ -2586,12 +2828,14 @@
           <w:lang w:val="en-US"/>
         </w:rPr>
       </w:pPr>
+      <w:bookmarkStart w:id="10" w:name="_Toc219301879"/>
       <w:r>
         <w:rPr>
           <w:lang w:val="en-US"/>
         </w:rPr>
         <w:t>SCSS</w:t>
       </w:r>
+      <w:bookmarkEnd w:id="10"/>
     </w:p>
     <w:p>
       <w:pPr>
@@ -2748,10 +2992,113 @@
     </w:p>
     <w:p>
       <w:pPr>
-        <w:rPr>
-          <w:lang w:val="en-US"/>
-        </w:rPr>
-      </w:pPr>
+        <w:pStyle w:val="ListParagraph"/>
+        <w:numPr>
+          <w:ilvl w:val="0"/>
+          <w:numId w:val="7"/>
+        </w:numPr>
+        <w:rPr>
+          <w:lang w:val="en-US"/>
+        </w:rPr>
+      </w:pPr>
+      <w:r>
+        <w:rPr>
+          <w:lang w:val="en-US"/>
+        </w:rPr>
+        <w:t>Trang Calendar</w:t>
+      </w:r>
+    </w:p>
+    <w:p>
+      <w:pPr>
+        <w:rPr>
+          <w:lang w:val="en-US"/>
+        </w:rPr>
+      </w:pPr>
+      <w:r>
+        <w:rPr>
+          <w:lang w:val="en-US"/>
+        </w:rPr>
+        <w:t>Trang chính gồm các thành phần: tháng – năm, ngày, âm lịch, sự thật thú vị. Thứ tự này đảm bảo người dùng tiếp nhận thông tin dễ dàng. Ngoài ra, nếu màn hình nhỏ hơn thì chữ sẽ được thu nhỏ để phù hợp với màn hình điện thoại.</w:t>
+      </w:r>
+    </w:p>
+    <w:p>
+      <w:pPr>
+        <w:keepNext/>
+      </w:pPr>
+      <w:r>
+        <w:rPr>
+          <w:noProof/>
+          <w:lang w:val="en-US"/>
+        </w:rPr>
+        <w:lastRenderedPageBreak/>
+        <w:drawing>
+          <wp:inline distT="0" distB="0" distL="0" distR="0" wp14:anchorId="1AEFA057" wp14:editId="6195DDBC">
+            <wp:extent cx="5731510" cy="2768600"/>
+            <wp:effectExtent l="0" t="0" r="2540" b="0"/>
+            <wp:docPr id="1884711152" name="Picture 1"/>
+            <wp:cNvGraphicFramePr>
+              <a:graphicFrameLocks xmlns:a="http://schemas.openxmlformats.org/drawingml/2006/main" noChangeAspect="1"/>
+            </wp:cNvGraphicFramePr>
+            <a:graphic xmlns:a="http://schemas.openxmlformats.org/drawingml/2006/main">
+              <a:graphicData uri="http://schemas.openxmlformats.org/drawingml/2006/picture">
+                <pic:pic xmlns:pic="http://schemas.openxmlformats.org/drawingml/2006/picture">
+                  <pic:nvPicPr>
+                    <pic:cNvPr id="1884711152" name="Picture 1884711152"/>
+                    <pic:cNvPicPr/>
+                  </pic:nvPicPr>
+                  <pic:blipFill>
+                    <a:blip r:embed="rId13" cstate="print">
+                      <a:extLst>
+                        <a:ext uri="{28A0092B-C50C-407E-A947-70E740481C1C}">
+                          <a14:useLocalDpi xmlns:a14="http://schemas.microsoft.com/office/drawing/2010/main" val="0"/>
+                        </a:ext>
+                      </a:extLst>
+                    </a:blip>
+                    <a:stretch>
+                      <a:fillRect/>
+                    </a:stretch>
+                  </pic:blipFill>
+                  <pic:spPr>
+                    <a:xfrm>
+                      <a:off x="0" y="0"/>
+                      <a:ext cx="5731510" cy="2768600"/>
+                    </a:xfrm>
+                    <a:prstGeom prst="rect">
+                      <a:avLst/>
+                    </a:prstGeom>
+                  </pic:spPr>
+                </pic:pic>
+              </a:graphicData>
+            </a:graphic>
+          </wp:inline>
+        </w:drawing>
+      </w:r>
+    </w:p>
+    <w:p>
+      <w:pPr>
+        <w:pStyle w:val="Caption"/>
+        <w:jc w:val="center"/>
+        <w:rPr>
+          <w:lang w:val="en-US"/>
+        </w:rPr>
+      </w:pPr>
+      <w:r>
+        <w:t xml:space="preserve">Hình </w:t>
+      </w:r>
+      <w:fldSimple w:instr=" SEQ Hình \* ARABIC ">
+        <w:r>
+          <w:rPr>
+            <w:noProof/>
+          </w:rPr>
+          <w:t>4</w:t>
+        </w:r>
+      </w:fldSimple>
+      <w:r>
+        <w:rPr>
+          <w:lang w:val="en-US"/>
+        </w:rPr>
+        <w:t>: ScienceCalendar trên máy tính</w:t>
+      </w:r>
     </w:p>
     <w:p>
       <w:pPr>
@@ -2765,13 +3112,84 @@
     </w:p>
     <w:p>
       <w:pPr>
+        <w:keepNext/>
         <w:tabs>
           <w:tab w:val="left" w:pos="2645"/>
         </w:tabs>
-        <w:rPr>
-          <w:lang w:val="en-US"/>
-        </w:rPr>
-      </w:pPr>
+      </w:pPr>
+      <w:r>
+        <w:rPr>
+          <w:noProof/>
+          <w:lang w:val="en-US"/>
+        </w:rPr>
+        <w:drawing>
+          <wp:inline distT="0" distB="0" distL="0" distR="0" wp14:anchorId="39D9BB76" wp14:editId="4D1CDE86">
+            <wp:extent cx="5731510" cy="4075430"/>
+            <wp:effectExtent l="0" t="0" r="2540" b="1270"/>
+            <wp:docPr id="2134037537" name="Picture 2"/>
+            <wp:cNvGraphicFramePr>
+              <a:graphicFrameLocks xmlns:a="http://schemas.openxmlformats.org/drawingml/2006/main" noChangeAspect="1"/>
+            </wp:cNvGraphicFramePr>
+            <a:graphic xmlns:a="http://schemas.openxmlformats.org/drawingml/2006/main">
+              <a:graphicData uri="http://schemas.openxmlformats.org/drawingml/2006/picture">
+                <pic:pic xmlns:pic="http://schemas.openxmlformats.org/drawingml/2006/picture">
+                  <pic:nvPicPr>
+                    <pic:cNvPr id="2134037537" name="Picture 2134037537"/>
+                    <pic:cNvPicPr/>
+                  </pic:nvPicPr>
+                  <pic:blipFill>
+                    <a:blip r:embed="rId14">
+                      <a:extLst>
+                        <a:ext uri="{28A0092B-C50C-407E-A947-70E740481C1C}">
+                          <a14:useLocalDpi xmlns:a14="http://schemas.microsoft.com/office/drawing/2010/main" val="0"/>
+                        </a:ext>
+                      </a:extLst>
+                    </a:blip>
+                    <a:stretch>
+                      <a:fillRect/>
+                    </a:stretch>
+                  </pic:blipFill>
+                  <pic:spPr>
+                    <a:xfrm>
+                      <a:off x="0" y="0"/>
+                      <a:ext cx="5731510" cy="4075430"/>
+                    </a:xfrm>
+                    <a:prstGeom prst="rect">
+                      <a:avLst/>
+                    </a:prstGeom>
+                  </pic:spPr>
+                </pic:pic>
+              </a:graphicData>
+            </a:graphic>
+          </wp:inline>
+        </w:drawing>
+      </w:r>
+    </w:p>
+    <w:p>
+      <w:pPr>
+        <w:pStyle w:val="Caption"/>
+        <w:jc w:val="center"/>
+        <w:rPr>
+          <w:lang w:val="en-US"/>
+        </w:rPr>
+      </w:pPr>
+      <w:r>
+        <w:t xml:space="preserve">Hình </w:t>
+      </w:r>
+      <w:fldSimple w:instr=" SEQ Hình \* ARABIC ">
+        <w:r>
+          <w:rPr>
+            <w:noProof/>
+          </w:rPr>
+          <w:t>5</w:t>
+        </w:r>
+      </w:fldSimple>
+      <w:r>
+        <w:rPr>
+          <w:lang w:val="en-US"/>
+        </w:rPr>
+        <w:t>: ScienceCalendar trên điện thoại</w:t>
+      </w:r>
     </w:p>
     <w:p>
       <w:pPr>

</xml_diff>

<commit_message>
feat: add testing setup with Vitest and create initial Calendar test
- Updated package.json to include Vitest and testing dependencies
- Refactored Calendar component for cleaner code
- Added Calendar test file with a basic render test
- Created Vitest configuration for jsdom environment
</commit_message>
<xml_diff>
--- a/Report/Report.docx
+++ b/Report/Report.docx
@@ -2537,13 +2537,12 @@
       <w:r>
         <w:rPr>
           <w:noProof/>
-          <w:lang w:val="en-US"/>
         </w:rPr>
         <w:drawing>
-          <wp:inline distT="0" distB="0" distL="0" distR="0" wp14:anchorId="5EF9A8C1" wp14:editId="2E96B9E8">
-            <wp:extent cx="5731510" cy="2044700"/>
-            <wp:effectExtent l="0" t="0" r="2540" b="0"/>
-            <wp:docPr id="146660881" name="Picture 2"/>
+          <wp:inline distT="0" distB="0" distL="0" distR="0" wp14:anchorId="043B1507" wp14:editId="75E4409A">
+            <wp:extent cx="5731510" cy="3556635"/>
+            <wp:effectExtent l="0" t="0" r="2540" b="5715"/>
+            <wp:docPr id="665800525" name="Picture 1"/>
             <wp:cNvGraphicFramePr>
               <a:graphicFrameLocks xmlns:a="http://schemas.openxmlformats.org/drawingml/2006/main" noChangeAspect="1"/>
             </wp:cNvGraphicFramePr>
@@ -2551,7 +2550,7 @@
               <a:graphicData uri="http://schemas.openxmlformats.org/drawingml/2006/picture">
                 <pic:pic xmlns:pic="http://schemas.openxmlformats.org/drawingml/2006/picture">
                   <pic:nvPicPr>
-                    <pic:cNvPr id="146660881" name="Picture 146660881"/>
+                    <pic:cNvPr id="665800525" name="Picture 665800525"/>
                     <pic:cNvPicPr/>
                   </pic:nvPicPr>
                   <pic:blipFill>
@@ -2569,7 +2568,7 @@
                   <pic:spPr>
                     <a:xfrm>
                       <a:off x="0" y="0"/>
-                      <a:ext cx="5731510" cy="2044700"/>
+                      <a:ext cx="5731510" cy="3556635"/>
                     </a:xfrm>
                     <a:prstGeom prst="rect">
                       <a:avLst/>
@@ -2708,6 +2707,7 @@
         <w:rPr>
           <w:lang w:val="en-US"/>
         </w:rPr>
+        <w:lastRenderedPageBreak/>
         <w:t>UpdatedAt</w:t>
       </w:r>
     </w:p>
@@ -2798,6 +2798,164 @@
     </w:p>
     <w:p>
       <w:pPr>
+        <w:rPr>
+          <w:lang w:val="en-US"/>
+        </w:rPr>
+      </w:pPr>
+      <w:r>
+        <w:rPr>
+          <w:lang w:val="en-US"/>
+        </w:rPr>
+        <w:t>Bảng Events:</w:t>
+      </w:r>
+    </w:p>
+    <w:p>
+      <w:pPr>
+        <w:pStyle w:val="ListParagraph"/>
+        <w:numPr>
+          <w:ilvl w:val="0"/>
+          <w:numId w:val="6"/>
+        </w:numPr>
+        <w:rPr>
+          <w:lang w:val="en-US"/>
+        </w:rPr>
+      </w:pPr>
+      <w:r>
+        <w:rPr>
+          <w:lang w:val="en-US"/>
+        </w:rPr>
+        <w:t>Event</w:t>
+      </w:r>
+      <w:r>
+        <w:rPr>
+          <w:lang w:val="en-US"/>
+        </w:rPr>
+        <w:t>ID</w:t>
+      </w:r>
+    </w:p>
+    <w:p>
+      <w:pPr>
+        <w:pStyle w:val="ListParagraph"/>
+        <w:numPr>
+          <w:ilvl w:val="0"/>
+          <w:numId w:val="6"/>
+        </w:numPr>
+        <w:rPr>
+          <w:lang w:val="en-US"/>
+        </w:rPr>
+      </w:pPr>
+      <w:r>
+        <w:rPr>
+          <w:lang w:val="en-US"/>
+        </w:rPr>
+        <w:t>Event</w:t>
+      </w:r>
+      <w:r>
+        <w:rPr>
+          <w:lang w:val="en-US"/>
+        </w:rPr>
+        <w:t>Name</w:t>
+      </w:r>
+    </w:p>
+    <w:p>
+      <w:pPr>
+        <w:pStyle w:val="ListParagraph"/>
+        <w:numPr>
+          <w:ilvl w:val="0"/>
+          <w:numId w:val="6"/>
+        </w:numPr>
+        <w:rPr>
+          <w:lang w:val="en-US"/>
+        </w:rPr>
+      </w:pPr>
+      <w:r>
+        <w:rPr>
+          <w:lang w:val="en-US"/>
+        </w:rPr>
+        <w:t>Image</w:t>
+      </w:r>
+    </w:p>
+    <w:p>
+      <w:pPr>
+        <w:pStyle w:val="ListParagraph"/>
+        <w:numPr>
+          <w:ilvl w:val="0"/>
+          <w:numId w:val="6"/>
+        </w:numPr>
+        <w:rPr>
+          <w:lang w:val="en-US"/>
+        </w:rPr>
+      </w:pPr>
+      <w:r>
+        <w:rPr>
+          <w:lang w:val="en-US"/>
+        </w:rPr>
+        <w:t>Date</w:t>
+      </w:r>
+    </w:p>
+    <w:p>
+      <w:pPr>
+        <w:pStyle w:val="ListParagraph"/>
+        <w:numPr>
+          <w:ilvl w:val="0"/>
+          <w:numId w:val="6"/>
+        </w:numPr>
+        <w:rPr>
+          <w:lang w:val="en-US"/>
+        </w:rPr>
+      </w:pPr>
+      <w:r>
+        <w:rPr>
+          <w:lang w:val="en-US"/>
+        </w:rPr>
+        <w:t>CalendarType</w:t>
+      </w:r>
+    </w:p>
+    <w:p>
+      <w:pPr>
+        <w:pStyle w:val="ListParagraph"/>
+        <w:numPr>
+          <w:ilvl w:val="0"/>
+          <w:numId w:val="6"/>
+        </w:numPr>
+        <w:rPr>
+          <w:lang w:val="en-US"/>
+        </w:rPr>
+      </w:pPr>
+      <w:r>
+        <w:rPr>
+          <w:lang w:val="en-US"/>
+        </w:rPr>
+        <w:t>CreatedAt</w:t>
+      </w:r>
+    </w:p>
+    <w:p>
+      <w:pPr>
+        <w:pStyle w:val="ListParagraph"/>
+        <w:numPr>
+          <w:ilvl w:val="0"/>
+          <w:numId w:val="6"/>
+        </w:numPr>
+        <w:rPr>
+          <w:lang w:val="en-US"/>
+        </w:rPr>
+      </w:pPr>
+      <w:r>
+        <w:rPr>
+          <w:lang w:val="en-US"/>
+        </w:rPr>
+        <w:t>UpdatedAt</w:t>
+      </w:r>
+    </w:p>
+    <w:p>
+      <w:pPr>
+        <w:rPr>
+          <w:lang w:val="en-US"/>
+        </w:rPr>
+      </w:pPr>
+    </w:p>
+    <w:p>
+      <w:pPr>
         <w:pStyle w:val="Heading1"/>
         <w:numPr>
           <w:ilvl w:val="0"/>
@@ -2812,7 +2970,6 @@
         <w:rPr>
           <w:lang w:val="en-US"/>
         </w:rPr>
-        <w:lastRenderedPageBreak/>
         <w:t>Giao diện</w:t>
       </w:r>
       <w:bookmarkEnd w:id="9"/>
@@ -3030,7 +3187,6 @@
           <w:noProof/>
           <w:lang w:val="en-US"/>
         </w:rPr>
-        <w:lastRenderedPageBreak/>
         <w:drawing>
           <wp:inline distT="0" distB="0" distL="0" distR="0" wp14:anchorId="1AEFA057" wp14:editId="6195DDBC">
             <wp:extent cx="5731510" cy="2768600"/>
@@ -3122,6 +3278,7 @@
           <w:noProof/>
           <w:lang w:val="en-US"/>
         </w:rPr>
+        <w:lastRenderedPageBreak/>
         <w:drawing>
           <wp:inline distT="0" distB="0" distL="0" distR="0" wp14:anchorId="39D9BB76" wp14:editId="4D1CDE86">
             <wp:extent cx="5731510" cy="4075430"/>

</xml_diff>

<commit_message>
feat: refactor Calendar component and add utility for subject class determination
</commit_message>
<xml_diff>
--- a/Report/Report.docx
+++ b/Report/Report.docx
@@ -779,6 +779,7 @@
         <w:rPr>
           <w:bCs/>
           <w:noProof/>
+          <w:sz w:val="26"/>
         </w:rPr>
       </w:sdtEndPr>
       <w:sdtContent>
@@ -2707,20 +2708,20 @@
         <w:rPr>
           <w:lang w:val="en-US"/>
         </w:rPr>
+        <w:t>UpdatedAt</w:t>
+      </w:r>
+    </w:p>
+    <w:p>
+      <w:pPr>
+        <w:rPr>
+          <w:lang w:val="en-US"/>
+        </w:rPr>
+      </w:pPr>
+      <w:r>
+        <w:rPr>
+          <w:lang w:val="en-US"/>
+        </w:rPr>
         <w:lastRenderedPageBreak/>
-        <w:t>UpdatedAt</w:t>
-      </w:r>
-    </w:p>
-    <w:p>
-      <w:pPr>
-        <w:rPr>
-          <w:lang w:val="en-US"/>
-        </w:rPr>
-      </w:pPr>
-      <w:r>
-        <w:rPr>
-          <w:lang w:val="en-US"/>
-        </w:rPr>
         <w:t>Bảng FactCategories:</w:t>
       </w:r>
     </w:p>
@@ -3175,6 +3176,7 @@
         <w:rPr>
           <w:lang w:val="en-US"/>
         </w:rPr>
+        <w:lastRenderedPageBreak/>
         <w:t>Trang chính gồm các thành phần: tháng – năm, ngày, âm lịch, sự thật thú vị. Thứ tự này đảm bảo người dùng tiếp nhận thông tin dễ dàng. Ngoài ra, nếu màn hình nhỏ hơn thì chữ sẽ được thu nhỏ để phù hợp với màn hình điện thoại.</w:t>
       </w:r>
     </w:p>
@@ -3278,7 +3280,6 @@
           <w:noProof/>
           <w:lang w:val="en-US"/>
         </w:rPr>
-        <w:lastRenderedPageBreak/>
         <w:drawing>
           <wp:inline distT="0" distB="0" distL="0" distR="0" wp14:anchorId="39D9BB76" wp14:editId="4D1CDE86">
             <wp:extent cx="5731510" cy="4075430"/>
@@ -3360,6 +3361,152 @@
     </w:p>
     <w:p>
       <w:pPr>
+        <w:pStyle w:val="Heading2"/>
+        <w:numPr>
+          <w:ilvl w:val="0"/>
+          <w:numId w:val="7"/>
+        </w:numPr>
+        <w:rPr>
+          <w:lang w:val="en-US"/>
+        </w:rPr>
+      </w:pPr>
+      <w:r>
+        <w:rPr>
+          <w:lang w:val="en-US"/>
+        </w:rPr>
+        <w:lastRenderedPageBreak/>
+        <w:t>Testing</w:t>
+      </w:r>
+    </w:p>
+    <w:p>
+      <w:pPr>
+        <w:pStyle w:val="Heading3"/>
+        <w:numPr>
+          <w:ilvl w:val="1"/>
+          <w:numId w:val="7"/>
+        </w:numPr>
+        <w:rPr>
+          <w:lang w:val="en-US"/>
+        </w:rPr>
+      </w:pPr>
+      <w:r>
+        <w:rPr>
+          <w:lang w:val="en-US"/>
+        </w:rPr>
+        <w:t>Kiểm tra lịch hiển thị</w:t>
+      </w:r>
+    </w:p>
+    <w:p>
+      <w:pPr>
+        <w:rPr>
+          <w:lang w:val="en-US"/>
+        </w:rPr>
+      </w:pPr>
+      <w:r>
+        <w:rPr>
+          <w:lang w:val="en-US"/>
+        </w:rPr>
+        <w:t>Bài</w:t>
+      </w:r>
+      <w:r>
+        <w:rPr>
+          <w:lang w:val="en-US"/>
+        </w:rPr>
+        <w:t xml:space="preserve"> test này nhằm kiếm tra xem ngày hôm nay có được render đúng hay không. File sé kiểm tra các element có trong DOM hay không rồi kiếm tra xem nó có giống như ngày, tháng, năm được lấy ra từ thư viện</w:t>
+      </w:r>
+      <w:r>
+        <w:rPr>
+          <w:lang w:val="en-US"/>
+        </w:rPr>
+        <w:t xml:space="preserve"> hay không</w:t>
+      </w:r>
+      <w:r>
+        <w:rPr>
+          <w:lang w:val="en-US"/>
+        </w:rPr>
+        <w:t>.</w:t>
+      </w:r>
+    </w:p>
+    <w:p>
+      <w:pPr>
+        <w:keepNext/>
+      </w:pPr>
+      <w:r>
+        <w:rPr>
+          <w:noProof/>
+          <w:lang w:val="en-US"/>
+        </w:rPr>
+        <w:drawing>
+          <wp:inline distT="0" distB="0" distL="0" distR="0" wp14:anchorId="2E404E57" wp14:editId="35A6D69D">
+            <wp:extent cx="5731510" cy="3044190"/>
+            <wp:effectExtent l="0" t="0" r="2540" b="3810"/>
+            <wp:docPr id="360446166" name="Picture 1"/>
+            <wp:cNvGraphicFramePr>
+              <a:graphicFrameLocks xmlns:a="http://schemas.openxmlformats.org/drawingml/2006/main" noChangeAspect="1"/>
+            </wp:cNvGraphicFramePr>
+            <a:graphic xmlns:a="http://schemas.openxmlformats.org/drawingml/2006/main">
+              <a:graphicData uri="http://schemas.openxmlformats.org/drawingml/2006/picture">
+                <pic:pic xmlns:pic="http://schemas.openxmlformats.org/drawingml/2006/picture">
+                  <pic:nvPicPr>
+                    <pic:cNvPr id="360446166" name="Picture 360446166"/>
+                    <pic:cNvPicPr/>
+                  </pic:nvPicPr>
+                  <pic:blipFill>
+                    <a:blip r:embed="rId15" cstate="print">
+                      <a:extLst>
+                        <a:ext uri="{28A0092B-C50C-407E-A947-70E740481C1C}">
+                          <a14:useLocalDpi xmlns:a14="http://schemas.microsoft.com/office/drawing/2010/main" val="0"/>
+                        </a:ext>
+                      </a:extLst>
+                    </a:blip>
+                    <a:stretch>
+                      <a:fillRect/>
+                    </a:stretch>
+                  </pic:blipFill>
+                  <pic:spPr>
+                    <a:xfrm>
+                      <a:off x="0" y="0"/>
+                      <a:ext cx="5731510" cy="3044190"/>
+                    </a:xfrm>
+                    <a:prstGeom prst="rect">
+                      <a:avLst/>
+                    </a:prstGeom>
+                  </pic:spPr>
+                </pic:pic>
+              </a:graphicData>
+            </a:graphic>
+          </wp:inline>
+        </w:drawing>
+      </w:r>
+    </w:p>
+    <w:p>
+      <w:pPr>
+        <w:pStyle w:val="Caption"/>
+        <w:jc w:val="center"/>
+        <w:rPr>
+          <w:lang w:val="en-US"/>
+        </w:rPr>
+      </w:pPr>
+      <w:r>
+        <w:t xml:space="preserve">Hình </w:t>
+      </w:r>
+      <w:fldSimple w:instr=" SEQ Hình \* ARABIC ">
+        <w:r>
+          <w:rPr>
+            <w:noProof/>
+          </w:rPr>
+          <w:t>6</w:t>
+        </w:r>
+      </w:fldSimple>
+      <w:r>
+        <w:rPr>
+          <w:lang w:val="en-US"/>
+        </w:rPr>
+        <w:t>: Code kiểm tra ngày</w:t>
+      </w:r>
+    </w:p>
+    <w:p>
+      <w:pPr>
         <w:tabs>
           <w:tab w:val="left" w:pos="2645"/>
         </w:tabs>
@@ -3370,23 +3517,113 @@
     </w:p>
     <w:p>
       <w:pPr>
-        <w:tabs>
-          <w:tab w:val="left" w:pos="2645"/>
-        </w:tabs>
-        <w:rPr>
-          <w:lang w:val="en-US"/>
-        </w:rPr>
-      </w:pPr>
-    </w:p>
-    <w:p>
-      <w:pPr>
-        <w:tabs>
-          <w:tab w:val="left" w:pos="2645"/>
-        </w:tabs>
-        <w:rPr>
-          <w:lang w:val="en-US"/>
-        </w:rPr>
-      </w:pPr>
+        <w:pStyle w:val="Heading3"/>
+        <w:numPr>
+          <w:ilvl w:val="1"/>
+          <w:numId w:val="7"/>
+        </w:numPr>
+        <w:rPr>
+          <w:lang w:val="en-US"/>
+        </w:rPr>
+      </w:pPr>
+      <w:r>
+        <w:rPr>
+          <w:lang w:val="en-US"/>
+        </w:rPr>
+        <w:t>Kiểm tra theme theo ngày</w:t>
+      </w:r>
+    </w:p>
+    <w:p>
+      <w:pPr>
+        <w:rPr>
+          <w:lang w:val="en-US"/>
+        </w:rPr>
+      </w:pPr>
+      <w:r>
+        <w:rPr>
+          <w:lang w:val="en-US"/>
+        </w:rPr>
+        <w:t>Bài test này nhằm kiểm tra xem background có thay đổi theo ngày với ngày chia dư 1 cho màu xám, dư 2 màu xanh dương, dư 3 màu hồng và chia hết màu xanh lá cây</w:t>
+      </w:r>
+    </w:p>
+    <w:p>
+      <w:pPr>
+        <w:keepNext/>
+      </w:pPr>
+      <w:r>
+        <w:rPr>
+          <w:noProof/>
+          <w:lang w:val="en-US"/>
+        </w:rPr>
+        <w:lastRenderedPageBreak/>
+        <w:drawing>
+          <wp:inline distT="0" distB="0" distL="0" distR="0" wp14:anchorId="16EED3CA" wp14:editId="0C0C59C2">
+            <wp:extent cx="5731510" cy="3937635"/>
+            <wp:effectExtent l="0" t="0" r="2540" b="5715"/>
+            <wp:docPr id="781855163" name="Picture 1"/>
+            <wp:cNvGraphicFramePr>
+              <a:graphicFrameLocks xmlns:a="http://schemas.openxmlformats.org/drawingml/2006/main" noChangeAspect="1"/>
+            </wp:cNvGraphicFramePr>
+            <a:graphic xmlns:a="http://schemas.openxmlformats.org/drawingml/2006/main">
+              <a:graphicData uri="http://schemas.openxmlformats.org/drawingml/2006/picture">
+                <pic:pic xmlns:pic="http://schemas.openxmlformats.org/drawingml/2006/picture">
+                  <pic:nvPicPr>
+                    <pic:cNvPr id="781855163" name="Picture 781855163"/>
+                    <pic:cNvPicPr/>
+                  </pic:nvPicPr>
+                  <pic:blipFill>
+                    <a:blip r:embed="rId16">
+                      <a:extLst>
+                        <a:ext uri="{28A0092B-C50C-407E-A947-70E740481C1C}">
+                          <a14:useLocalDpi xmlns:a14="http://schemas.microsoft.com/office/drawing/2010/main" val="0"/>
+                        </a:ext>
+                      </a:extLst>
+                    </a:blip>
+                    <a:stretch>
+                      <a:fillRect/>
+                    </a:stretch>
+                  </pic:blipFill>
+                  <pic:spPr>
+                    <a:xfrm>
+                      <a:off x="0" y="0"/>
+                      <a:ext cx="5731510" cy="3937635"/>
+                    </a:xfrm>
+                    <a:prstGeom prst="rect">
+                      <a:avLst/>
+                    </a:prstGeom>
+                  </pic:spPr>
+                </pic:pic>
+              </a:graphicData>
+            </a:graphic>
+          </wp:inline>
+        </w:drawing>
+      </w:r>
+    </w:p>
+    <w:p>
+      <w:pPr>
+        <w:pStyle w:val="Caption"/>
+        <w:jc w:val="center"/>
+        <w:rPr>
+          <w:lang w:val="en-US"/>
+        </w:rPr>
+      </w:pPr>
+      <w:r>
+        <w:t xml:space="preserve">Hình </w:t>
+      </w:r>
+      <w:fldSimple w:instr=" SEQ Hình \* ARABIC ">
+        <w:r>
+          <w:rPr>
+            <w:noProof/>
+          </w:rPr>
+          <w:t>7</w:t>
+        </w:r>
+      </w:fldSimple>
+      <w:r>
+        <w:rPr>
+          <w:lang w:val="en-US"/>
+        </w:rPr>
+        <w:t>: Code kiểm tra theme</w:t>
+      </w:r>
     </w:p>
     <w:p>
       <w:pPr>
@@ -4210,9 +4447,9 @@
   </w:abstractNum>
   <w:abstractNum w:abstractNumId="6" w15:restartNumberingAfterBreak="0">
     <w:nsid w:val="7E58414A"/>
-    <w:multiLevelType w:val="hybridMultilevel"/>
-    <w:tmpl w:val="89921B1C"/>
-    <w:lvl w:ilvl="0" w:tplc="042A000F">
+    <w:multiLevelType w:val="multilevel"/>
+    <w:tmpl w:val="EC8EBE0A"/>
+    <w:lvl w:ilvl="0">
       <w:start w:val="1"/>
       <w:numFmt w:val="decimal"/>
       <w:lvlText w:val="%1."/>
@@ -4224,77 +4461,109 @@
         <w:rFonts w:hint="default"/>
       </w:rPr>
     </w:lvl>
-    <w:lvl w:ilvl="1" w:tplc="042A0019" w:tentative="1">
-      <w:start w:val="1"/>
-      <w:numFmt w:val="lowerLetter"/>
-      <w:lvlText w:val="%2."/>
-      <w:lvlJc w:val="left"/>
-      <w:pPr>
-        <w:ind w:left="1440" w:hanging="360"/>
-      </w:pPr>
-    </w:lvl>
-    <w:lvl w:ilvl="2" w:tplc="042A001B" w:tentative="1">
-      <w:start w:val="1"/>
-      <w:numFmt w:val="lowerRoman"/>
-      <w:lvlText w:val="%3."/>
-      <w:lvlJc w:val="right"/>
-      <w:pPr>
-        <w:ind w:left="2160" w:hanging="180"/>
-      </w:pPr>
-    </w:lvl>
-    <w:lvl w:ilvl="3" w:tplc="042A000F" w:tentative="1">
+    <w:lvl w:ilvl="1">
       <w:start w:val="1"/>
       <w:numFmt w:val="decimal"/>
-      <w:lvlText w:val="%4."/>
-      <w:lvlJc w:val="left"/>
-      <w:pPr>
-        <w:ind w:left="2880" w:hanging="360"/>
-      </w:pPr>
-    </w:lvl>
-    <w:lvl w:ilvl="4" w:tplc="042A0019" w:tentative="1">
-      <w:start w:val="1"/>
-      <w:numFmt w:val="lowerLetter"/>
-      <w:lvlText w:val="%5."/>
-      <w:lvlJc w:val="left"/>
-      <w:pPr>
-        <w:ind w:left="3600" w:hanging="360"/>
-      </w:pPr>
-    </w:lvl>
-    <w:lvl w:ilvl="5" w:tplc="042A001B" w:tentative="1">
-      <w:start w:val="1"/>
-      <w:numFmt w:val="lowerRoman"/>
-      <w:lvlText w:val="%6."/>
-      <w:lvlJc w:val="right"/>
-      <w:pPr>
-        <w:ind w:left="4320" w:hanging="180"/>
-      </w:pPr>
-    </w:lvl>
-    <w:lvl w:ilvl="6" w:tplc="042A000F" w:tentative="1">
+      <w:isLgl/>
+      <w:lvlText w:val="%1.%2."/>
+      <w:lvlJc w:val="left"/>
+      <w:pPr>
+        <w:ind w:left="1080" w:hanging="720"/>
+      </w:pPr>
+      <w:rPr>
+        <w:rFonts w:hint="default"/>
+      </w:rPr>
+    </w:lvl>
+    <w:lvl w:ilvl="2">
       <w:start w:val="1"/>
       <w:numFmt w:val="decimal"/>
-      <w:lvlText w:val="%7."/>
-      <w:lvlJc w:val="left"/>
-      <w:pPr>
-        <w:ind w:left="5040" w:hanging="360"/>
-      </w:pPr>
-    </w:lvl>
-    <w:lvl w:ilvl="7" w:tplc="042A0019" w:tentative="1">
-      <w:start w:val="1"/>
-      <w:numFmt w:val="lowerLetter"/>
-      <w:lvlText w:val="%8."/>
-      <w:lvlJc w:val="left"/>
-      <w:pPr>
-        <w:ind w:left="5760" w:hanging="360"/>
-      </w:pPr>
-    </w:lvl>
-    <w:lvl w:ilvl="8" w:tplc="042A001B" w:tentative="1">
-      <w:start w:val="1"/>
-      <w:numFmt w:val="lowerRoman"/>
-      <w:lvlText w:val="%9."/>
-      <w:lvlJc w:val="right"/>
-      <w:pPr>
-        <w:ind w:left="6480" w:hanging="180"/>
-      </w:pPr>
+      <w:isLgl/>
+      <w:lvlText w:val="%1.%2.%3."/>
+      <w:lvlJc w:val="left"/>
+      <w:pPr>
+        <w:ind w:left="1080" w:hanging="720"/>
+      </w:pPr>
+      <w:rPr>
+        <w:rFonts w:hint="default"/>
+      </w:rPr>
+    </w:lvl>
+    <w:lvl w:ilvl="3">
+      <w:start w:val="1"/>
+      <w:numFmt w:val="decimal"/>
+      <w:isLgl/>
+      <w:lvlText w:val="%1.%2.%3.%4."/>
+      <w:lvlJc w:val="left"/>
+      <w:pPr>
+        <w:ind w:left="1440" w:hanging="1080"/>
+      </w:pPr>
+      <w:rPr>
+        <w:rFonts w:hint="default"/>
+      </w:rPr>
+    </w:lvl>
+    <w:lvl w:ilvl="4">
+      <w:start w:val="1"/>
+      <w:numFmt w:val="decimal"/>
+      <w:isLgl/>
+      <w:lvlText w:val="%1.%2.%3.%4.%5."/>
+      <w:lvlJc w:val="left"/>
+      <w:pPr>
+        <w:ind w:left="1800" w:hanging="1440"/>
+      </w:pPr>
+      <w:rPr>
+        <w:rFonts w:hint="default"/>
+      </w:rPr>
+    </w:lvl>
+    <w:lvl w:ilvl="5">
+      <w:start w:val="1"/>
+      <w:numFmt w:val="decimal"/>
+      <w:isLgl/>
+      <w:lvlText w:val="%1.%2.%3.%4.%5.%6."/>
+      <w:lvlJc w:val="left"/>
+      <w:pPr>
+        <w:ind w:left="1800" w:hanging="1440"/>
+      </w:pPr>
+      <w:rPr>
+        <w:rFonts w:hint="default"/>
+      </w:rPr>
+    </w:lvl>
+    <w:lvl w:ilvl="6">
+      <w:start w:val="1"/>
+      <w:numFmt w:val="decimal"/>
+      <w:isLgl/>
+      <w:lvlText w:val="%1.%2.%3.%4.%5.%6.%7."/>
+      <w:lvlJc w:val="left"/>
+      <w:pPr>
+        <w:ind w:left="2160" w:hanging="1800"/>
+      </w:pPr>
+      <w:rPr>
+        <w:rFonts w:hint="default"/>
+      </w:rPr>
+    </w:lvl>
+    <w:lvl w:ilvl="7">
+      <w:start w:val="1"/>
+      <w:numFmt w:val="decimal"/>
+      <w:isLgl/>
+      <w:lvlText w:val="%1.%2.%3.%4.%5.%6.%7.%8."/>
+      <w:lvlJc w:val="left"/>
+      <w:pPr>
+        <w:ind w:left="2520" w:hanging="2160"/>
+      </w:pPr>
+      <w:rPr>
+        <w:rFonts w:hint="default"/>
+      </w:rPr>
+    </w:lvl>
+    <w:lvl w:ilvl="8">
+      <w:start w:val="1"/>
+      <w:numFmt w:val="decimal"/>
+      <w:isLgl/>
+      <w:lvlText w:val="%1.%2.%3.%4.%5.%6.%7.%8.%9."/>
+      <w:lvlJc w:val="left"/>
+      <w:pPr>
+        <w:ind w:left="2520" w:hanging="2160"/>
+      </w:pPr>
+      <w:rPr>
+        <w:rFonts w:hint="default"/>
+      </w:rPr>
     </w:lvl>
   </w:abstractNum>
   <w:abstractNum w:abstractNumId="7" w15:restartNumberingAfterBreak="0">
@@ -4815,6 +5084,10 @@
   <w:style w:type="paragraph" w:default="1" w:styleId="Normal">
     <w:name w:val="Normal"/>
     <w:qFormat/>
+    <w:rsid w:val="0076385F"/>
+    <w:rPr>
+      <w:sz w:val="26"/>
+    </w:rPr>
   </w:style>
   <w:style w:type="paragraph" w:styleId="Heading1">
     <w:name w:val="heading 1"/>
@@ -4846,7 +5119,7 @@
     <w:uiPriority w:val="9"/>
     <w:unhideWhenUsed/>
     <w:qFormat/>
-    <w:rsid w:val="00CA6D6B"/>
+    <w:rsid w:val="0076385F"/>
     <w:pPr>
       <w:keepNext/>
       <w:keepLines/>
@@ -4855,7 +5128,9 @@
     </w:pPr>
     <w:rPr>
       <w:rFonts w:asciiTheme="majorHAnsi" w:eastAsiaTheme="majorEastAsia" w:hAnsiTheme="majorHAnsi" w:cstheme="majorBidi"/>
+      <w:b/>
       <w:color w:val="000000" w:themeColor="text1"/>
+      <w:sz w:val="28"/>
       <w:szCs w:val="32"/>
     </w:rPr>
   </w:style>
@@ -4865,10 +5140,9 @@
     <w:next w:val="Normal"/>
     <w:link w:val="Heading3Char"/>
     <w:uiPriority w:val="9"/>
-    <w:semiHidden/>
     <w:unhideWhenUsed/>
     <w:qFormat/>
-    <w:rsid w:val="00BC744D"/>
+    <w:rsid w:val="0076385F"/>
     <w:pPr>
       <w:keepNext/>
       <w:keepLines/>
@@ -4876,8 +5150,10 @@
       <w:outlineLvl w:val="2"/>
     </w:pPr>
     <w:rPr>
-      <w:rFonts w:asciiTheme="minorHAnsi" w:eastAsiaTheme="majorEastAsia" w:hAnsiTheme="minorHAnsi" w:cstheme="majorBidi"/>
-      <w:color w:val="0F4761" w:themeColor="accent1" w:themeShade="BF"/>
+      <w:rFonts w:eastAsiaTheme="majorEastAsia" w:cstheme="majorBidi"/>
+      <w:b/>
+      <w:color w:val="000000" w:themeColor="text1"/>
+      <w:sz w:val="28"/>
       <w:szCs w:val="28"/>
     </w:rPr>
   </w:style>
@@ -5059,9 +5335,10 @@
     <w:basedOn w:val="DefaultParagraphFont"/>
     <w:link w:val="Heading2"/>
     <w:uiPriority w:val="9"/>
-    <w:rsid w:val="00CA6D6B"/>
+    <w:rsid w:val="0076385F"/>
     <w:rPr>
       <w:rFonts w:asciiTheme="majorHAnsi" w:eastAsiaTheme="majorEastAsia" w:hAnsiTheme="majorHAnsi" w:cstheme="majorBidi"/>
+      <w:b/>
       <w:color w:val="000000" w:themeColor="text1"/>
       <w:szCs w:val="32"/>
     </w:rPr>
@@ -5071,11 +5348,11 @@
     <w:basedOn w:val="DefaultParagraphFont"/>
     <w:link w:val="Heading3"/>
     <w:uiPriority w:val="9"/>
-    <w:semiHidden/>
-    <w:rsid w:val="00BC744D"/>
+    <w:rsid w:val="0076385F"/>
     <w:rPr>
-      <w:rFonts w:asciiTheme="minorHAnsi" w:eastAsiaTheme="majorEastAsia" w:hAnsiTheme="minorHAnsi" w:cstheme="majorBidi"/>
-      <w:color w:val="0F4761" w:themeColor="accent1" w:themeShade="BF"/>
+      <w:rFonts w:eastAsiaTheme="majorEastAsia" w:cstheme="majorBidi"/>
+      <w:b/>
+      <w:color w:val="000000" w:themeColor="text1"/>
       <w:szCs w:val="28"/>
     </w:rPr>
   </w:style>

</xml_diff>